<commit_message>
docs: update CV with latest edits (PDF + DOCX)
Co-Authored-By: Claude Sonnet 4.6 <noreply@anthropic.com>
</commit_message>
<xml_diff>
--- a/3D_portfolio/public/Suhil_Jugroop_CV.docx
+++ b/3D_portfolio/public/Suhil_Jugroop_CV.docx
@@ -218,6 +218,15 @@
                 <w:sz w:val="15"/>
                 <w:szCs w:val="15"/>
               </w:rPr>
+              <w:t>um Laude</w:t>
+            </w:r>
+            <w:r>
+              <w:rPr>
+                <w:rFonts w:ascii="Calibri" w:eastAsia="Calibri" w:hAnsi="Calibri" w:cs="Calibri"/>
+                <w:color w:val="000000"/>
+                <w:sz w:val="15"/>
+                <w:szCs w:val="15"/>
+              </w:rPr>
               <w:t xml:space="preserve"> May 2026</w:t>
             </w:r>
           </w:p>
@@ -1873,16 +1882,7 @@
           <w:sz w:val="15"/>
           <w:szCs w:val="15"/>
         </w:rPr>
-        <w:t>|</w:t>
-      </w:r>
-      <w:r>
-        <w:rPr>
-          <w:rFonts w:ascii="Calibri" w:eastAsia="Calibri" w:hAnsi="Calibri" w:cs="Calibri"/>
-          <w:color w:val="C9A84C"/>
-          <w:sz w:val="15"/>
-          <w:szCs w:val="15"/>
-        </w:rPr>
-        <w:t xml:space="preserve">   </w:t>
+        <w:t xml:space="preserve">|   </w:t>
       </w:r>
       <w:r>
         <w:rPr>

</xml_diff>

<commit_message>
docs: update CV PDF with latest edits
Co-Authored-By: Claude Sonnet 4.6 <noreply@anthropic.com>
</commit_message>
<xml_diff>
--- a/3D_portfolio/public/Suhil_Jugroop_CV.docx
+++ b/3D_portfolio/public/Suhil_Jugroop_CV.docx
@@ -175,19 +175,8 @@
                 <w:sz w:val="15"/>
                 <w:szCs w:val="15"/>
               </w:rPr>
-              <w:t xml:space="preserve">Belgium Campus </w:t>
-            </w:r>
-            <w:proofErr w:type="spellStart"/>
-            <w:r>
-              <w:rPr>
-                <w:rFonts w:ascii="Calibri" w:eastAsia="Calibri" w:hAnsi="Calibri" w:cs="Calibri"/>
-                <w:color w:val="666666"/>
-                <w:sz w:val="15"/>
-                <w:szCs w:val="15"/>
-              </w:rPr>
-              <w:t>ITVersity</w:t>
-            </w:r>
-            <w:proofErr w:type="spellEnd"/>
+              <w:t>Belgium Campus ITVersity</w:t>
+            </w:r>
           </w:p>
           <w:p>
             <w:pPr>
@@ -243,31 +232,7 @@
                 <w:sz w:val="15"/>
                 <w:szCs w:val="15"/>
               </w:rPr>
-              <w:t xml:space="preserve">73.5% </w:t>
-            </w:r>
-            <w:proofErr w:type="spellStart"/>
-            <w:r>
-              <w:rPr>
-                <w:rFonts w:ascii="Calibri" w:eastAsia="Calibri" w:hAnsi="Calibri" w:cs="Calibri"/>
-                <w:b/>
-                <w:bCs/>
-                <w:color w:val="000000"/>
-                <w:sz w:val="15"/>
-                <w:szCs w:val="15"/>
-              </w:rPr>
-              <w:t>Avg</w:t>
-            </w:r>
-            <w:proofErr w:type="spellEnd"/>
-            <w:r>
-              <w:rPr>
-                <w:rFonts w:ascii="Calibri" w:eastAsia="Calibri" w:hAnsi="Calibri" w:cs="Calibri"/>
-                <w:b/>
-                <w:bCs/>
-                <w:color w:val="000000"/>
-                <w:sz w:val="15"/>
-                <w:szCs w:val="15"/>
-              </w:rPr>
-              <w:t xml:space="preserve"> · 26 Distinctions</w:t>
+              <w:t>73.5% Avg · 26 Distinctions</w:t>
             </w:r>
           </w:p>
           <w:p>
@@ -485,27 +450,7 @@
                 <w:sz w:val="15"/>
                 <w:szCs w:val="15"/>
               </w:rPr>
-              <w:t xml:space="preserve">React, Next.js 15, Three.js, R3F, Tailwind, </w:t>
-            </w:r>
-            <w:proofErr w:type="spellStart"/>
-            <w:r>
-              <w:rPr>
-                <w:rFonts w:ascii="Calibri" w:eastAsia="Calibri" w:hAnsi="Calibri" w:cs="Calibri"/>
-                <w:color w:val="000000"/>
-                <w:sz w:val="15"/>
-                <w:szCs w:val="15"/>
-              </w:rPr>
-              <w:t>Shadcn</w:t>
-            </w:r>
-            <w:proofErr w:type="spellEnd"/>
-            <w:r>
-              <w:rPr>
-                <w:rFonts w:ascii="Calibri" w:eastAsia="Calibri" w:hAnsi="Calibri" w:cs="Calibri"/>
-                <w:color w:val="000000"/>
-                <w:sz w:val="15"/>
-                <w:szCs w:val="15"/>
-              </w:rPr>
-              <w:t xml:space="preserve"> UI</w:t>
+              <w:t>React, Next.js 15, Three.js, R3F, Tailwind, Shadcn UI</w:t>
             </w:r>
           </w:p>
           <w:p>
@@ -530,27 +475,7 @@
                 <w:sz w:val="15"/>
                 <w:szCs w:val="15"/>
               </w:rPr>
-              <w:t xml:space="preserve">Node.js, Express.js, REST APIs, Serverless, Firebase, </w:t>
-            </w:r>
-            <w:proofErr w:type="spellStart"/>
-            <w:r>
-              <w:rPr>
-                <w:rFonts w:ascii="Calibri" w:eastAsia="Calibri" w:hAnsi="Calibri" w:cs="Calibri"/>
-                <w:color w:val="000000"/>
-                <w:sz w:val="15"/>
-                <w:szCs w:val="15"/>
-              </w:rPr>
-              <w:t>Firestore</w:t>
-            </w:r>
-            <w:proofErr w:type="spellEnd"/>
-            <w:r>
-              <w:rPr>
-                <w:rFonts w:ascii="Calibri" w:eastAsia="Calibri" w:hAnsi="Calibri" w:cs="Calibri"/>
-                <w:color w:val="000000"/>
-                <w:sz w:val="15"/>
-                <w:szCs w:val="15"/>
-              </w:rPr>
-              <w:t>, MongoDB, MySQL</w:t>
+              <w:t>Node.js, Express.js, REST APIs, Serverless, Firebase, Firestore, MongoDB, MySQL</w:t>
             </w:r>
           </w:p>
           <w:p>
@@ -568,25 +493,14 @@
               </w:rPr>
               <w:t xml:space="preserve">AI &amp; ML: </w:t>
             </w:r>
-            <w:proofErr w:type="spellStart"/>
-            <w:r>
-              <w:rPr>
-                <w:rFonts w:ascii="Calibri" w:eastAsia="Calibri" w:hAnsi="Calibri" w:cs="Calibri"/>
-                <w:color w:val="000000"/>
-                <w:sz w:val="15"/>
-                <w:szCs w:val="15"/>
-              </w:rPr>
-              <w:t>Genkit</w:t>
-            </w:r>
-            <w:proofErr w:type="spellEnd"/>
-            <w:r>
-              <w:rPr>
-                <w:rFonts w:ascii="Calibri" w:eastAsia="Calibri" w:hAnsi="Calibri" w:cs="Calibri"/>
-                <w:color w:val="000000"/>
-                <w:sz w:val="15"/>
-                <w:szCs w:val="15"/>
-              </w:rPr>
-              <w:t>, Gemini, YOLO, Neural Networks (NumPy), Scikit-learn, Pandas, Matplotlib, SciPy</w:t>
+            <w:r>
+              <w:rPr>
+                <w:rFonts w:ascii="Calibri" w:eastAsia="Calibri" w:hAnsi="Calibri" w:cs="Calibri"/>
+                <w:color w:val="000000"/>
+                <w:sz w:val="15"/>
+                <w:szCs w:val="15"/>
+              </w:rPr>
+              <w:t>Genkit, Gemini, YOLO, Neural Networks (NumPy), Scikit-learn, Pandas, Matplotlib, SciPy</w:t>
             </w:r>
           </w:p>
           <w:p>
@@ -675,27 +589,7 @@
                 <w:sz w:val="15"/>
                 <w:szCs w:val="15"/>
               </w:rPr>
-              <w:t xml:space="preserve">Led the 11-person </w:t>
-            </w:r>
-            <w:proofErr w:type="spellStart"/>
-            <w:r>
-              <w:rPr>
-                <w:rFonts w:ascii="Calibri" w:eastAsia="Calibri" w:hAnsi="Calibri" w:cs="Calibri"/>
-                <w:color w:val="000000"/>
-                <w:sz w:val="15"/>
-                <w:szCs w:val="15"/>
-              </w:rPr>
-              <w:t>Invascan</w:t>
-            </w:r>
-            <w:proofErr w:type="spellEnd"/>
-            <w:r>
-              <w:rPr>
-                <w:rFonts w:ascii="Calibri" w:eastAsia="Calibri" w:hAnsi="Calibri" w:cs="Calibri"/>
-                <w:color w:val="000000"/>
-                <w:sz w:val="15"/>
-                <w:szCs w:val="15"/>
-              </w:rPr>
-              <w:t xml:space="preserve"> capstone team (incl. 4 senior industry professionals) as project lead — managing sprint delivery, stakeholder reporting to lecturers, deans and external partners, and cross-discipline collaboration from requirements through final evaluation.</w:t>
+              <w:t>Led the 11-person Invascan capstone team (incl. 4 senior industry professionals) as project lead — managing sprint delivery, stakeholder reporting to lecturers, deans and external partners, and cross-discipline collaboration from requirements through final evaluation.</w:t>
             </w:r>
           </w:p>
           <w:p>
@@ -776,15 +670,35 @@
           <w:p>
             <w:pPr>
               <w:spacing w:after="20"/>
-            </w:pPr>
-            <w:r>
               <w:rPr>
                 <w:rFonts w:ascii="Calibri" w:eastAsia="Calibri" w:hAnsi="Calibri" w:cs="Calibri"/>
                 <w:color w:val="666666"/>
                 <w:sz w:val="15"/>
                 <w:szCs w:val="15"/>
               </w:rPr>
+            </w:pPr>
+            <w:r>
+              <w:rPr>
+                <w:rFonts w:ascii="Calibri" w:eastAsia="Calibri" w:hAnsi="Calibri" w:cs="Calibri"/>
+                <w:color w:val="666666"/>
+                <w:sz w:val="15"/>
+                <w:szCs w:val="15"/>
+              </w:rPr>
               <w:t>github.com/Timeshot0311</w:t>
+            </w:r>
+          </w:p>
+          <w:p>
+            <w:pPr>
+              <w:spacing w:after="20"/>
+            </w:pPr>
+            <w:r>
+              <w:rPr>
+                <w:rFonts w:ascii="Calibri" w:eastAsia="Calibri" w:hAnsi="Calibri" w:cs="Calibri"/>
+                <w:color w:val="666666"/>
+                <w:sz w:val="15"/>
+                <w:szCs w:val="15"/>
+              </w:rPr>
+              <w:t>suhiljugroop.com</w:t>
             </w:r>
           </w:p>
         </w:tc>
@@ -853,47 +767,7 @@
                 <w:sz w:val="15"/>
                 <w:szCs w:val="15"/>
               </w:rPr>
-              <w:t xml:space="preserve">Full-stack developer and recent IT graduate specialising in generative AI, cloud-native architecture, and production web systems. Graduated with a 73.5% weighted average and 26 distinctions from Belgium Campus </w:t>
-            </w:r>
-            <w:proofErr w:type="spellStart"/>
-            <w:r>
-              <w:rPr>
-                <w:rFonts w:ascii="Calibri" w:eastAsia="Calibri" w:hAnsi="Calibri" w:cs="Calibri"/>
-                <w:color w:val="000000"/>
-                <w:sz w:val="15"/>
-                <w:szCs w:val="15"/>
-              </w:rPr>
-              <w:t>ITVersity</w:t>
-            </w:r>
-            <w:proofErr w:type="spellEnd"/>
-            <w:r>
-              <w:rPr>
-                <w:rFonts w:ascii="Calibri" w:eastAsia="Calibri" w:hAnsi="Calibri" w:cs="Calibri"/>
-                <w:color w:val="000000"/>
-                <w:sz w:val="15"/>
-                <w:szCs w:val="15"/>
-              </w:rPr>
-              <w:t xml:space="preserve"> (top 9 in cohort). Delivered real-world client tools — including a live legal case management PWA and a production business website — alongside AI-integrated academic platforms using Next.js, TypeScript, Firebase, and Google AI (</w:t>
-            </w:r>
-            <w:proofErr w:type="spellStart"/>
-            <w:r>
-              <w:rPr>
-                <w:rFonts w:ascii="Calibri" w:eastAsia="Calibri" w:hAnsi="Calibri" w:cs="Calibri"/>
-                <w:color w:val="000000"/>
-                <w:sz w:val="15"/>
-                <w:szCs w:val="15"/>
-              </w:rPr>
-              <w:t>Genkit</w:t>
-            </w:r>
-            <w:proofErr w:type="spellEnd"/>
-            <w:r>
-              <w:rPr>
-                <w:rFonts w:ascii="Calibri" w:eastAsia="Calibri" w:hAnsi="Calibri" w:cs="Calibri"/>
-                <w:color w:val="000000"/>
-                <w:sz w:val="15"/>
-                <w:szCs w:val="15"/>
-              </w:rPr>
-              <w:t>/Gemini). Experienced in system architecture, OOP design, data science, and leading cross-functional teams.</w:t>
+              <w:t>Full-stack developer and recent IT graduate specialising in generative AI, cloud-native architecture, and production web systems. Graduated with a 73.5% weighted average and 26 distinctions from Belgium Campus ITVersity (top 9 in cohort). Delivered real-world client tools — including a live legal case management PWA and a production business website — alongside AI-integrated academic platforms using Next.js, TypeScript, Firebase, and Google AI (Genkit/Gemini). Experienced in system architecture, OOP design, data science, and leading cross-functional teams.</w:t>
             </w:r>
           </w:p>
           <w:p>
@@ -925,7 +799,6 @@
             <w:pPr>
               <w:spacing w:before="50" w:after="15"/>
             </w:pPr>
-            <w:proofErr w:type="spellStart"/>
             <w:r>
               <w:rPr>
                 <w:rFonts w:ascii="Calibri" w:eastAsia="Calibri" w:hAnsi="Calibri" w:cs="Calibri"/>
@@ -937,7 +810,6 @@
               </w:rPr>
               <w:t>LexDesk</w:t>
             </w:r>
-            <w:proofErr w:type="spellEnd"/>
             <w:r>
               <w:rPr>
                 <w:rFonts w:ascii="Calibri" w:eastAsia="Calibri" w:hAnsi="Calibri" w:cs="Calibri"/>
@@ -981,19 +853,8 @@
                 <w:sz w:val="15"/>
                 <w:szCs w:val="15"/>
               </w:rPr>
-              <w:t xml:space="preserve">Automated PDF generation for invoices, court pleadings, and correspondence via </w:t>
-            </w:r>
-            <w:proofErr w:type="spellStart"/>
-            <w:r>
-              <w:rPr>
-                <w:rFonts w:ascii="Calibri" w:eastAsia="Calibri" w:hAnsi="Calibri" w:cs="Calibri"/>
-                <w:color w:val="000000"/>
-                <w:sz w:val="15"/>
-                <w:szCs w:val="15"/>
-              </w:rPr>
-              <w:t>jsPDF</w:t>
-            </w:r>
-            <w:proofErr w:type="spellEnd"/>
+              <w:t>Automated PDF generation for invoices, court pleadings, and correspondence via jsPDF</w:t>
+            </w:r>
           </w:p>
           <w:p>
             <w:pPr>
@@ -1010,47 +871,7 @@
                 <w:sz w:val="15"/>
                 <w:szCs w:val="15"/>
               </w:rPr>
-              <w:t xml:space="preserve">Offline-first via </w:t>
-            </w:r>
-            <w:proofErr w:type="spellStart"/>
-            <w:r>
-              <w:rPr>
-                <w:rFonts w:ascii="Calibri" w:eastAsia="Calibri" w:hAnsi="Calibri" w:cs="Calibri"/>
-                <w:color w:val="000000"/>
-                <w:sz w:val="15"/>
-                <w:szCs w:val="15"/>
-              </w:rPr>
-              <w:t>Firestore</w:t>
-            </w:r>
-            <w:proofErr w:type="spellEnd"/>
-            <w:r>
-              <w:rPr>
-                <w:rFonts w:ascii="Calibri" w:eastAsia="Calibri" w:hAnsi="Calibri" w:cs="Calibri"/>
-                <w:color w:val="000000"/>
-                <w:sz w:val="15"/>
-                <w:szCs w:val="15"/>
-              </w:rPr>
-              <w:t>, PWA install support, integrated calendar with .</w:t>
-            </w:r>
-            <w:proofErr w:type="spellStart"/>
-            <w:r>
-              <w:rPr>
-                <w:rFonts w:ascii="Calibri" w:eastAsia="Calibri" w:hAnsi="Calibri" w:cs="Calibri"/>
-                <w:color w:val="000000"/>
-                <w:sz w:val="15"/>
-                <w:szCs w:val="15"/>
-              </w:rPr>
-              <w:t>ics</w:t>
-            </w:r>
-            <w:proofErr w:type="spellEnd"/>
-            <w:r>
-              <w:rPr>
-                <w:rFonts w:ascii="Calibri" w:eastAsia="Calibri" w:hAnsi="Calibri" w:cs="Calibri"/>
-                <w:color w:val="000000"/>
-                <w:sz w:val="15"/>
-                <w:szCs w:val="15"/>
-              </w:rPr>
-              <w:t xml:space="preserve"> export, RBAC</w:t>
+              <w:t>Offline-first via Firestore, PWA install support, integrated calendar with .ics export, RBAC</w:t>
             </w:r>
           </w:p>
           <w:p>
@@ -1066,9 +887,74 @@
                 <w:sz w:val="14"/>
                 <w:szCs w:val="14"/>
               </w:rPr>
-              <w:t xml:space="preserve">Tech: Next.js 15 · Firebase · </w:t>
-            </w:r>
-            <w:proofErr w:type="spellStart"/>
+              <w:t>Tech: Next.js 15 · Firebase · Firestore · Shadcn UI · Tailwind · jsPDF · PWA</w:t>
+            </w:r>
+          </w:p>
+          <w:p>
+            <w:pPr>
+              <w:spacing w:before="50" w:after="15"/>
+            </w:pPr>
+            <w:r>
+              <w:rPr>
+                <w:rFonts w:ascii="Calibri" w:eastAsia="Calibri" w:hAnsi="Calibri" w:cs="Calibri"/>
+                <w:b/>
+                <w:bCs/>
+                <w:color w:val="1B2A4A"/>
+                <w:sz w:val="16"/>
+                <w:szCs w:val="16"/>
+              </w:rPr>
+              <w:t>CampusLearn</w:t>
+            </w:r>
+            <w:r>
+              <w:rPr>
+                <w:rFonts w:ascii="Calibri" w:eastAsia="Calibri" w:hAnsi="Calibri" w:cs="Calibri"/>
+                <w:color w:val="666666"/>
+                <w:sz w:val="14"/>
+                <w:szCs w:val="14"/>
+              </w:rPr>
+              <w:t xml:space="preserve"> — AI-enabled role-based academic platform (serverless Google Cloud)</w:t>
+            </w:r>
+          </w:p>
+          <w:p>
+            <w:pPr>
+              <w:pStyle w:val="ListParagraph"/>
+              <w:numPr>
+                <w:ilvl w:val="0"/>
+                <w:numId w:val="2"/>
+              </w:numPr>
+            </w:pPr>
+            <w:r>
+              <w:rPr>
+                <w:rFonts w:ascii="Calibri" w:eastAsia="Calibri" w:hAnsi="Calibri" w:cs="Calibri"/>
+                <w:color w:val="000000"/>
+                <w:sz w:val="15"/>
+                <w:szCs w:val="15"/>
+              </w:rPr>
+              <w:t>Multi-role system (students/tutors/lecturers/admins) with full auth, RBAC, course management, grading</w:t>
+            </w:r>
+          </w:p>
+          <w:p>
+            <w:pPr>
+              <w:pStyle w:val="ListParagraph"/>
+              <w:numPr>
+                <w:ilvl w:val="0"/>
+                <w:numId w:val="2"/>
+              </w:numPr>
+            </w:pPr>
+            <w:r>
+              <w:rPr>
+                <w:rFonts w:ascii="Calibri" w:eastAsia="Calibri" w:hAnsi="Calibri" w:cs="Calibri"/>
+                <w:color w:val="000000"/>
+                <w:sz w:val="15"/>
+                <w:szCs w:val="15"/>
+              </w:rPr>
+              <w:t>AI tutor using Gemini via Genkit with document retrieval; real-time Firestore sync; Cypress E2E coverage</w:t>
+            </w:r>
+          </w:p>
+          <w:p>
+            <w:pPr>
+              <w:spacing w:after="30"/>
+            </w:pPr>
             <w:r>
               <w:rPr>
                 <w:rFonts w:ascii="Calibri" w:eastAsia="Calibri" w:hAnsi="Calibri" w:cs="Calibri"/>
@@ -1078,9 +964,56 @@
                 <w:sz w:val="14"/>
                 <w:szCs w:val="14"/>
               </w:rPr>
-              <w:t>Firestore</w:t>
-            </w:r>
-            <w:proofErr w:type="spellEnd"/>
+              <w:t>Tech: Next.js · TypeScript · Firebase · Genkit · Gemini · Tailwind · Cypress</w:t>
+            </w:r>
+          </w:p>
+          <w:p>
+            <w:pPr>
+              <w:spacing w:before="50" w:after="15"/>
+            </w:pPr>
+            <w:r>
+              <w:rPr>
+                <w:rFonts w:ascii="Calibri" w:eastAsia="Calibri" w:hAnsi="Calibri" w:cs="Calibri"/>
+                <w:b/>
+                <w:bCs/>
+                <w:color w:val="1B2A4A"/>
+                <w:sz w:val="16"/>
+                <w:szCs w:val="16"/>
+              </w:rPr>
+              <w:t>ScholarAI</w:t>
+            </w:r>
+            <w:r>
+              <w:rPr>
+                <w:rFonts w:ascii="Calibri" w:eastAsia="Calibri" w:hAnsi="Calibri" w:cs="Calibri"/>
+                <w:color w:val="666666"/>
+                <w:sz w:val="14"/>
+                <w:szCs w:val="14"/>
+              </w:rPr>
+              <w:t xml:space="preserve"> — GenAI personal tutor with adaptive learning</w:t>
+            </w:r>
+          </w:p>
+          <w:p>
+            <w:pPr>
+              <w:pStyle w:val="ListParagraph"/>
+              <w:numPr>
+                <w:ilvl w:val="0"/>
+                <w:numId w:val="2"/>
+              </w:numPr>
+            </w:pPr>
+            <w:r>
+              <w:rPr>
+                <w:rFonts w:ascii="Calibri" w:eastAsia="Calibri" w:hAnsi="Calibri" w:cs="Calibri"/>
+                <w:color w:val="000000"/>
+                <w:sz w:val="15"/>
+                <w:szCs w:val="15"/>
+              </w:rPr>
+              <w:t>Socratic dialogue, multi-modal inputs (text, voice, docs), adaptive quizzes, performance-based coaching</w:t>
+            </w:r>
+          </w:p>
+          <w:p>
+            <w:pPr>
+              <w:spacing w:after="30"/>
+            </w:pPr>
             <w:r>
               <w:rPr>
                 <w:rFonts w:ascii="Calibri" w:eastAsia="Calibri" w:hAnsi="Calibri" w:cs="Calibri"/>
@@ -1090,9 +1023,56 @@
                 <w:sz w:val="14"/>
                 <w:szCs w:val="14"/>
               </w:rPr>
-              <w:t xml:space="preserve"> · </w:t>
-            </w:r>
-            <w:proofErr w:type="spellStart"/>
+              <w:t>Tech: Next.js 15 · TypeScript · Genkit · Gemini · Zustand · Firebase</w:t>
+            </w:r>
+          </w:p>
+          <w:p>
+            <w:pPr>
+              <w:spacing w:before="50" w:after="15"/>
+            </w:pPr>
+            <w:r>
+              <w:rPr>
+                <w:rFonts w:ascii="Calibri" w:eastAsia="Calibri" w:hAnsi="Calibri" w:cs="Calibri"/>
+                <w:b/>
+                <w:bCs/>
+                <w:color w:val="1B2A4A"/>
+                <w:sz w:val="16"/>
+                <w:szCs w:val="16"/>
+              </w:rPr>
+              <w:t>EduSphere Solutions</w:t>
+            </w:r>
+            <w:r>
+              <w:rPr>
+                <w:rFonts w:ascii="Calibri" w:eastAsia="Calibri" w:hAnsi="Calibri" w:cs="Calibri"/>
+                <w:color w:val="666666"/>
+                <w:sz w:val="14"/>
+                <w:szCs w:val="14"/>
+              </w:rPr>
+              <w:t xml:space="preserve"> (edu-sphere.co.za) — Production client website</w:t>
+            </w:r>
+          </w:p>
+          <w:p>
+            <w:pPr>
+              <w:pStyle w:val="ListParagraph"/>
+              <w:numPr>
+                <w:ilvl w:val="0"/>
+                <w:numId w:val="2"/>
+              </w:numPr>
+            </w:pPr>
+            <w:r>
+              <w:rPr>
+                <w:rFonts w:ascii="Calibri" w:eastAsia="Calibri" w:hAnsi="Calibri" w:cs="Calibri"/>
+                <w:color w:val="000000"/>
+                <w:sz w:val="15"/>
+                <w:szCs w:val="15"/>
+              </w:rPr>
+              <w:t>Designed and delivered a fully responsive production site for an IR consultancy, live and serving real clients</w:t>
+            </w:r>
+          </w:p>
+          <w:p>
+            <w:pPr>
+              <w:spacing w:after="30"/>
+            </w:pPr>
             <w:r>
               <w:rPr>
                 <w:rFonts w:ascii="Calibri" w:eastAsia="Calibri" w:hAnsi="Calibri" w:cs="Calibri"/>
@@ -1102,9 +1082,146 @@
                 <w:sz w:val="14"/>
                 <w:szCs w:val="14"/>
               </w:rPr>
-              <w:t>Shadcn</w:t>
-            </w:r>
-            <w:proofErr w:type="spellEnd"/>
+              <w:t>Tech: Next.js · Tailwind CSS · Shadcn UI</w:t>
+            </w:r>
+          </w:p>
+          <w:p>
+            <w:pPr>
+              <w:spacing w:before="50" w:after="15"/>
+            </w:pPr>
+            <w:r>
+              <w:rPr>
+                <w:rFonts w:ascii="Calibri" w:eastAsia="Calibri" w:hAnsi="Calibri" w:cs="Calibri"/>
+                <w:b/>
+                <w:bCs/>
+                <w:color w:val="1B2A4A"/>
+                <w:sz w:val="16"/>
+                <w:szCs w:val="16"/>
+              </w:rPr>
+              <w:t>Invascan</w:t>
+            </w:r>
+            <w:r>
+              <w:rPr>
+                <w:rFonts w:ascii="Calibri" w:eastAsia="Calibri" w:hAnsi="Calibri" w:cs="Calibri"/>
+                <w:color w:val="666666"/>
+                <w:sz w:val="14"/>
+                <w:szCs w:val="14"/>
+              </w:rPr>
+              <w:t xml:space="preserve"> (Final Year Capstone — Team Lead) — AI-powered invasive species detection</w:t>
+            </w:r>
+          </w:p>
+          <w:p>
+            <w:pPr>
+              <w:pStyle w:val="ListParagraph"/>
+              <w:numPr>
+                <w:ilvl w:val="0"/>
+                <w:numId w:val="2"/>
+              </w:numPr>
+            </w:pPr>
+            <w:r>
+              <w:rPr>
+                <w:rFonts w:ascii="Calibri" w:eastAsia="Calibri" w:hAnsi="Calibri" w:cs="Calibri"/>
+                <w:color w:val="000000"/>
+                <w:sz w:val="15"/>
+                <w:szCs w:val="15"/>
+              </w:rPr>
+              <w:t>Led cross-functional team of 11 (incl. 4 industry professionals) across full project lifecycle</w:t>
+            </w:r>
+          </w:p>
+          <w:p>
+            <w:pPr>
+              <w:pStyle w:val="ListParagraph"/>
+              <w:numPr>
+                <w:ilvl w:val="0"/>
+                <w:numId w:val="2"/>
+              </w:numPr>
+            </w:pPr>
+            <w:r>
+              <w:rPr>
+                <w:rFonts w:ascii="Calibri" w:eastAsia="Calibri" w:hAnsi="Calibri" w:cs="Calibri"/>
+                <w:color w:val="000000"/>
+                <w:sz w:val="15"/>
+                <w:szCs w:val="15"/>
+              </w:rPr>
+              <w:t>Architected YOLO-based computer vision pipeline for real-time Pyracantha species detection</w:t>
+            </w:r>
+          </w:p>
+          <w:p>
+            <w:pPr>
+              <w:pStyle w:val="ListParagraph"/>
+              <w:numPr>
+                <w:ilvl w:val="0"/>
+                <w:numId w:val="2"/>
+              </w:numPr>
+            </w:pPr>
+            <w:r>
+              <w:rPr>
+                <w:rFonts w:ascii="Calibri" w:eastAsia="Calibri" w:hAnsi="Calibri" w:cs="Calibri"/>
+                <w:color w:val="000000"/>
+                <w:sz w:val="15"/>
+                <w:szCs w:val="15"/>
+              </w:rPr>
+              <w:t>Owned end-to-end ML pipeline: dataset acquisition, cleaning, preprocessing, YOLO config, training, tuning</w:t>
+            </w:r>
+          </w:p>
+          <w:p>
+            <w:pPr>
+              <w:pStyle w:val="ListParagraph"/>
+              <w:numPr>
+                <w:ilvl w:val="0"/>
+                <w:numId w:val="2"/>
+              </w:numPr>
+            </w:pPr>
+            <w:r>
+              <w:rPr>
+                <w:rFonts w:ascii="Calibri" w:eastAsia="Calibri" w:hAnsi="Calibri" w:cs="Calibri"/>
+                <w:color w:val="000000"/>
+                <w:sz w:val="15"/>
+                <w:szCs w:val="15"/>
+              </w:rPr>
+              <w:t>Built reporting API and data filtering logic to surface meaningful detection results</w:t>
+            </w:r>
+          </w:p>
+          <w:p>
+            <w:pPr>
+              <w:pStyle w:val="ListParagraph"/>
+              <w:numPr>
+                <w:ilvl w:val="0"/>
+                <w:numId w:val="2"/>
+              </w:numPr>
+            </w:pPr>
+            <w:r>
+              <w:rPr>
+                <w:rFonts w:ascii="Calibri" w:eastAsia="Calibri" w:hAnsi="Calibri" w:cs="Calibri"/>
+                <w:color w:val="000000"/>
+                <w:sz w:val="15"/>
+                <w:szCs w:val="15"/>
+              </w:rPr>
+              <w:t>Containerised entire system with Docker — multi-service orchestration for consistent dev/deployment</w:t>
+            </w:r>
+          </w:p>
+          <w:p>
+            <w:pPr>
+              <w:pStyle w:val="ListParagraph"/>
+              <w:numPr>
+                <w:ilvl w:val="0"/>
+                <w:numId w:val="2"/>
+              </w:numPr>
+            </w:pPr>
+            <w:r>
+              <w:rPr>
+                <w:rFonts w:ascii="Calibri" w:eastAsia="Calibri" w:hAnsi="Calibri" w:cs="Calibri"/>
+                <w:color w:val="000000"/>
+                <w:sz w:val="15"/>
+                <w:szCs w:val="15"/>
+              </w:rPr>
+              <w:t>Coordinated stakeholder reporting across lecturers, deans, and external partners</w:t>
+            </w:r>
+          </w:p>
+          <w:p>
+            <w:pPr>
+              <w:spacing w:after="30"/>
+            </w:pPr>
             <w:r>
               <w:rPr>
                 <w:rFonts w:ascii="Calibri" w:eastAsia="Calibri" w:hAnsi="Calibri" w:cs="Calibri"/>
@@ -1114,38 +1231,13 @@
                 <w:sz w:val="14"/>
                 <w:szCs w:val="14"/>
               </w:rPr>
-              <w:t xml:space="preserve"> UI · Tailwind · </w:t>
-            </w:r>
-            <w:proofErr w:type="spellStart"/>
-            <w:r>
-              <w:rPr>
-                <w:rFonts w:ascii="Calibri" w:eastAsia="Calibri" w:hAnsi="Calibri" w:cs="Calibri"/>
-                <w:i/>
-                <w:iCs/>
-                <w:color w:val="666666"/>
-                <w:sz w:val="14"/>
-                <w:szCs w:val="14"/>
-              </w:rPr>
-              <w:t>jsPDF</w:t>
-            </w:r>
-            <w:proofErr w:type="spellEnd"/>
-            <w:r>
-              <w:rPr>
-                <w:rFonts w:ascii="Calibri" w:eastAsia="Calibri" w:hAnsi="Calibri" w:cs="Calibri"/>
-                <w:i/>
-                <w:iCs/>
-                <w:color w:val="666666"/>
-                <w:sz w:val="14"/>
-                <w:szCs w:val="14"/>
-              </w:rPr>
-              <w:t xml:space="preserve"> · PWA</w:t>
+              <w:t>Tech: Python · Ultralytics YOLOv8 · Docker · Computer Vision · OpenCV · NumPy</w:t>
             </w:r>
           </w:p>
           <w:p>
             <w:pPr>
               <w:spacing w:before="50" w:after="15"/>
             </w:pPr>
-            <w:proofErr w:type="spellStart"/>
             <w:r>
               <w:rPr>
                 <w:rFonts w:ascii="Calibri" w:eastAsia="Calibri" w:hAnsi="Calibri" w:cs="Calibri"/>
@@ -1155,532 +1247,8 @@
                 <w:sz w:val="16"/>
                 <w:szCs w:val="16"/>
               </w:rPr>
-              <w:t>CampusLearn</w:t>
-            </w:r>
-            <w:proofErr w:type="spellEnd"/>
-            <w:r>
-              <w:rPr>
-                <w:rFonts w:ascii="Calibri" w:eastAsia="Calibri" w:hAnsi="Calibri" w:cs="Calibri"/>
-                <w:color w:val="666666"/>
-                <w:sz w:val="14"/>
-                <w:szCs w:val="14"/>
-              </w:rPr>
-              <w:t xml:space="preserve"> — AI-enabled role-based academic platform (serverless Google Cloud)</w:t>
-            </w:r>
-          </w:p>
-          <w:p>
-            <w:pPr>
-              <w:pStyle w:val="ListParagraph"/>
-              <w:numPr>
-                <w:ilvl w:val="0"/>
-                <w:numId w:val="2"/>
-              </w:numPr>
-            </w:pPr>
-            <w:r>
-              <w:rPr>
-                <w:rFonts w:ascii="Calibri" w:eastAsia="Calibri" w:hAnsi="Calibri" w:cs="Calibri"/>
-                <w:color w:val="000000"/>
-                <w:sz w:val="15"/>
-                <w:szCs w:val="15"/>
-              </w:rPr>
-              <w:t>Multi-role system (students/tutors/lecturers/admins) with full auth, RBAC, course management, grading</w:t>
-            </w:r>
-          </w:p>
-          <w:p>
-            <w:pPr>
-              <w:pStyle w:val="ListParagraph"/>
-              <w:numPr>
-                <w:ilvl w:val="0"/>
-                <w:numId w:val="2"/>
-              </w:numPr>
-            </w:pPr>
-            <w:r>
-              <w:rPr>
-                <w:rFonts w:ascii="Calibri" w:eastAsia="Calibri" w:hAnsi="Calibri" w:cs="Calibri"/>
-                <w:color w:val="000000"/>
-                <w:sz w:val="15"/>
-                <w:szCs w:val="15"/>
-              </w:rPr>
-              <w:t xml:space="preserve">AI tutor using Gemini via </w:t>
-            </w:r>
-            <w:proofErr w:type="spellStart"/>
-            <w:r>
-              <w:rPr>
-                <w:rFonts w:ascii="Calibri" w:eastAsia="Calibri" w:hAnsi="Calibri" w:cs="Calibri"/>
-                <w:color w:val="000000"/>
-                <w:sz w:val="15"/>
-                <w:szCs w:val="15"/>
-              </w:rPr>
-              <w:t>Genkit</w:t>
-            </w:r>
-            <w:proofErr w:type="spellEnd"/>
-            <w:r>
-              <w:rPr>
-                <w:rFonts w:ascii="Calibri" w:eastAsia="Calibri" w:hAnsi="Calibri" w:cs="Calibri"/>
-                <w:color w:val="000000"/>
-                <w:sz w:val="15"/>
-                <w:szCs w:val="15"/>
-              </w:rPr>
-              <w:t xml:space="preserve"> with document retrieval; real-time </w:t>
-            </w:r>
-            <w:proofErr w:type="spellStart"/>
-            <w:r>
-              <w:rPr>
-                <w:rFonts w:ascii="Calibri" w:eastAsia="Calibri" w:hAnsi="Calibri" w:cs="Calibri"/>
-                <w:color w:val="000000"/>
-                <w:sz w:val="15"/>
-                <w:szCs w:val="15"/>
-              </w:rPr>
-              <w:t>Firestore</w:t>
-            </w:r>
-            <w:proofErr w:type="spellEnd"/>
-            <w:r>
-              <w:rPr>
-                <w:rFonts w:ascii="Calibri" w:eastAsia="Calibri" w:hAnsi="Calibri" w:cs="Calibri"/>
-                <w:color w:val="000000"/>
-                <w:sz w:val="15"/>
-                <w:szCs w:val="15"/>
-              </w:rPr>
-              <w:t xml:space="preserve"> sync; Cypress E2E coverage</w:t>
-            </w:r>
-          </w:p>
-          <w:p>
-            <w:pPr>
-              <w:spacing w:after="30"/>
-            </w:pPr>
-            <w:r>
-              <w:rPr>
-                <w:rFonts w:ascii="Calibri" w:eastAsia="Calibri" w:hAnsi="Calibri" w:cs="Calibri"/>
-                <w:i/>
-                <w:iCs/>
-                <w:color w:val="666666"/>
-                <w:sz w:val="14"/>
-                <w:szCs w:val="14"/>
-              </w:rPr>
-              <w:t xml:space="preserve">Tech: Next.js · TypeScript · Firebase · </w:t>
-            </w:r>
-            <w:proofErr w:type="spellStart"/>
-            <w:r>
-              <w:rPr>
-                <w:rFonts w:ascii="Calibri" w:eastAsia="Calibri" w:hAnsi="Calibri" w:cs="Calibri"/>
-                <w:i/>
-                <w:iCs/>
-                <w:color w:val="666666"/>
-                <w:sz w:val="14"/>
-                <w:szCs w:val="14"/>
-              </w:rPr>
-              <w:t>Genkit</w:t>
-            </w:r>
-            <w:proofErr w:type="spellEnd"/>
-            <w:r>
-              <w:rPr>
-                <w:rFonts w:ascii="Calibri" w:eastAsia="Calibri" w:hAnsi="Calibri" w:cs="Calibri"/>
-                <w:i/>
-                <w:iCs/>
-                <w:color w:val="666666"/>
-                <w:sz w:val="14"/>
-                <w:szCs w:val="14"/>
-              </w:rPr>
-              <w:t xml:space="preserve"> · Gemini · Tailwind · Cypress</w:t>
-            </w:r>
-          </w:p>
-          <w:p>
-            <w:pPr>
-              <w:spacing w:before="50" w:after="15"/>
-            </w:pPr>
-            <w:proofErr w:type="spellStart"/>
-            <w:r>
-              <w:rPr>
-                <w:rFonts w:ascii="Calibri" w:eastAsia="Calibri" w:hAnsi="Calibri" w:cs="Calibri"/>
-                <w:b/>
-                <w:bCs/>
-                <w:color w:val="1B2A4A"/>
-                <w:sz w:val="16"/>
-                <w:szCs w:val="16"/>
-              </w:rPr>
-              <w:t>ScholarAI</w:t>
-            </w:r>
-            <w:proofErr w:type="spellEnd"/>
-            <w:r>
-              <w:rPr>
-                <w:rFonts w:ascii="Calibri" w:eastAsia="Calibri" w:hAnsi="Calibri" w:cs="Calibri"/>
-                <w:color w:val="666666"/>
-                <w:sz w:val="14"/>
-                <w:szCs w:val="14"/>
-              </w:rPr>
-              <w:t xml:space="preserve"> — GenAI personal tutor with adaptive learning</w:t>
-            </w:r>
-          </w:p>
-          <w:p>
-            <w:pPr>
-              <w:pStyle w:val="ListParagraph"/>
-              <w:numPr>
-                <w:ilvl w:val="0"/>
-                <w:numId w:val="2"/>
-              </w:numPr>
-            </w:pPr>
-            <w:r>
-              <w:rPr>
-                <w:rFonts w:ascii="Calibri" w:eastAsia="Calibri" w:hAnsi="Calibri" w:cs="Calibri"/>
-                <w:color w:val="000000"/>
-                <w:sz w:val="15"/>
-                <w:szCs w:val="15"/>
-              </w:rPr>
-              <w:t>Socratic dialogue, multi-modal inputs (text, voice, docs), adaptive quizzes, performance-based coaching</w:t>
-            </w:r>
-          </w:p>
-          <w:p>
-            <w:pPr>
-              <w:spacing w:after="30"/>
-            </w:pPr>
-            <w:r>
-              <w:rPr>
-                <w:rFonts w:ascii="Calibri" w:eastAsia="Calibri" w:hAnsi="Calibri" w:cs="Calibri"/>
-                <w:i/>
-                <w:iCs/>
-                <w:color w:val="666666"/>
-                <w:sz w:val="14"/>
-                <w:szCs w:val="14"/>
-              </w:rPr>
-              <w:t xml:space="preserve">Tech: Next.js 15 · TypeScript · </w:t>
-            </w:r>
-            <w:proofErr w:type="spellStart"/>
-            <w:r>
-              <w:rPr>
-                <w:rFonts w:ascii="Calibri" w:eastAsia="Calibri" w:hAnsi="Calibri" w:cs="Calibri"/>
-                <w:i/>
-                <w:iCs/>
-                <w:color w:val="666666"/>
-                <w:sz w:val="14"/>
-                <w:szCs w:val="14"/>
-              </w:rPr>
-              <w:t>Genkit</w:t>
-            </w:r>
-            <w:proofErr w:type="spellEnd"/>
-            <w:r>
-              <w:rPr>
-                <w:rFonts w:ascii="Calibri" w:eastAsia="Calibri" w:hAnsi="Calibri" w:cs="Calibri"/>
-                <w:i/>
-                <w:iCs/>
-                <w:color w:val="666666"/>
-                <w:sz w:val="14"/>
-                <w:szCs w:val="14"/>
-              </w:rPr>
-              <w:t xml:space="preserve"> · Gemini · </w:t>
-            </w:r>
-            <w:proofErr w:type="spellStart"/>
-            <w:r>
-              <w:rPr>
-                <w:rFonts w:ascii="Calibri" w:eastAsia="Calibri" w:hAnsi="Calibri" w:cs="Calibri"/>
-                <w:i/>
-                <w:iCs/>
-                <w:color w:val="666666"/>
-                <w:sz w:val="14"/>
-                <w:szCs w:val="14"/>
-              </w:rPr>
-              <w:t>Zustand</w:t>
-            </w:r>
-            <w:proofErr w:type="spellEnd"/>
-            <w:r>
-              <w:rPr>
-                <w:rFonts w:ascii="Calibri" w:eastAsia="Calibri" w:hAnsi="Calibri" w:cs="Calibri"/>
-                <w:i/>
-                <w:iCs/>
-                <w:color w:val="666666"/>
-                <w:sz w:val="14"/>
-                <w:szCs w:val="14"/>
-              </w:rPr>
-              <w:t xml:space="preserve"> · Firebase</w:t>
-            </w:r>
-          </w:p>
-          <w:p>
-            <w:pPr>
-              <w:spacing w:before="50" w:after="15"/>
-            </w:pPr>
-            <w:proofErr w:type="spellStart"/>
-            <w:r>
-              <w:rPr>
-                <w:rFonts w:ascii="Calibri" w:eastAsia="Calibri" w:hAnsi="Calibri" w:cs="Calibri"/>
-                <w:b/>
-                <w:bCs/>
-                <w:color w:val="1B2A4A"/>
-                <w:sz w:val="16"/>
-                <w:szCs w:val="16"/>
-              </w:rPr>
-              <w:t>EduSphere</w:t>
-            </w:r>
-            <w:proofErr w:type="spellEnd"/>
-            <w:r>
-              <w:rPr>
-                <w:rFonts w:ascii="Calibri" w:eastAsia="Calibri" w:hAnsi="Calibri" w:cs="Calibri"/>
-                <w:b/>
-                <w:bCs/>
-                <w:color w:val="1B2A4A"/>
-                <w:sz w:val="16"/>
-                <w:szCs w:val="16"/>
-              </w:rPr>
-              <w:t xml:space="preserve"> Solutions</w:t>
-            </w:r>
-            <w:r>
-              <w:rPr>
-                <w:rFonts w:ascii="Calibri" w:eastAsia="Calibri" w:hAnsi="Calibri" w:cs="Calibri"/>
-                <w:color w:val="666666"/>
-                <w:sz w:val="14"/>
-                <w:szCs w:val="14"/>
-              </w:rPr>
-              <w:t xml:space="preserve"> (edu-sphere.co.za) — Production client website</w:t>
-            </w:r>
-          </w:p>
-          <w:p>
-            <w:pPr>
-              <w:pStyle w:val="ListParagraph"/>
-              <w:numPr>
-                <w:ilvl w:val="0"/>
-                <w:numId w:val="2"/>
-              </w:numPr>
-            </w:pPr>
-            <w:r>
-              <w:rPr>
-                <w:rFonts w:ascii="Calibri" w:eastAsia="Calibri" w:hAnsi="Calibri" w:cs="Calibri"/>
-                <w:color w:val="000000"/>
-                <w:sz w:val="15"/>
-                <w:szCs w:val="15"/>
-              </w:rPr>
-              <w:t>Designed and delivered a fully responsive production site for an IR consultancy, live and serving real clients</w:t>
-            </w:r>
-          </w:p>
-          <w:p>
-            <w:pPr>
-              <w:spacing w:after="30"/>
-            </w:pPr>
-            <w:r>
-              <w:rPr>
-                <w:rFonts w:ascii="Calibri" w:eastAsia="Calibri" w:hAnsi="Calibri" w:cs="Calibri"/>
-                <w:i/>
-                <w:iCs/>
-                <w:color w:val="666666"/>
-                <w:sz w:val="14"/>
-                <w:szCs w:val="14"/>
-              </w:rPr>
-              <w:t xml:space="preserve">Tech: Next.js · Tailwind CSS · </w:t>
-            </w:r>
-            <w:proofErr w:type="spellStart"/>
-            <w:r>
-              <w:rPr>
-                <w:rFonts w:ascii="Calibri" w:eastAsia="Calibri" w:hAnsi="Calibri" w:cs="Calibri"/>
-                <w:i/>
-                <w:iCs/>
-                <w:color w:val="666666"/>
-                <w:sz w:val="14"/>
-                <w:szCs w:val="14"/>
-              </w:rPr>
-              <w:t>Shadcn</w:t>
-            </w:r>
-            <w:proofErr w:type="spellEnd"/>
-            <w:r>
-              <w:rPr>
-                <w:rFonts w:ascii="Calibri" w:eastAsia="Calibri" w:hAnsi="Calibri" w:cs="Calibri"/>
-                <w:i/>
-                <w:iCs/>
-                <w:color w:val="666666"/>
-                <w:sz w:val="14"/>
-                <w:szCs w:val="14"/>
-              </w:rPr>
-              <w:t xml:space="preserve"> UI</w:t>
-            </w:r>
-          </w:p>
-          <w:p>
-            <w:pPr>
-              <w:spacing w:before="50" w:after="15"/>
-            </w:pPr>
-            <w:proofErr w:type="spellStart"/>
-            <w:r>
-              <w:rPr>
-                <w:rFonts w:ascii="Calibri" w:eastAsia="Calibri" w:hAnsi="Calibri" w:cs="Calibri"/>
-                <w:b/>
-                <w:bCs/>
-                <w:color w:val="1B2A4A"/>
-                <w:sz w:val="16"/>
-                <w:szCs w:val="16"/>
-              </w:rPr>
-              <w:t>Invascan</w:t>
-            </w:r>
-            <w:proofErr w:type="spellEnd"/>
-            <w:r>
-              <w:rPr>
-                <w:rFonts w:ascii="Calibri" w:eastAsia="Calibri" w:hAnsi="Calibri" w:cs="Calibri"/>
-                <w:color w:val="666666"/>
-                <w:sz w:val="14"/>
-                <w:szCs w:val="14"/>
-              </w:rPr>
-              <w:t xml:space="preserve"> (Final Year Capstone — Team Lead) — AI-powered invasive species detection</w:t>
-            </w:r>
-          </w:p>
-          <w:p>
-            <w:pPr>
-              <w:pStyle w:val="ListParagraph"/>
-              <w:numPr>
-                <w:ilvl w:val="0"/>
-                <w:numId w:val="2"/>
-              </w:numPr>
-            </w:pPr>
-            <w:r>
-              <w:rPr>
-                <w:rFonts w:ascii="Calibri" w:eastAsia="Calibri" w:hAnsi="Calibri" w:cs="Calibri"/>
-                <w:color w:val="000000"/>
-                <w:sz w:val="15"/>
-                <w:szCs w:val="15"/>
-              </w:rPr>
-              <w:t>Led cross-functional team of 11 (incl. 4 industry professionals) across full project lifecycle</w:t>
-            </w:r>
-          </w:p>
-          <w:p>
-            <w:pPr>
-              <w:pStyle w:val="ListParagraph"/>
-              <w:numPr>
-                <w:ilvl w:val="0"/>
-                <w:numId w:val="2"/>
-              </w:numPr>
-            </w:pPr>
-            <w:r>
-              <w:rPr>
-                <w:rFonts w:ascii="Calibri" w:eastAsia="Calibri" w:hAnsi="Calibri" w:cs="Calibri"/>
-                <w:color w:val="000000"/>
-                <w:sz w:val="15"/>
-                <w:szCs w:val="15"/>
-              </w:rPr>
-              <w:t>Architected YOLO-based computer vision pipeline for real-time Pyracantha species detection</w:t>
-            </w:r>
-          </w:p>
-          <w:p>
-            <w:pPr>
-              <w:pStyle w:val="ListParagraph"/>
-              <w:numPr>
-                <w:ilvl w:val="0"/>
-                <w:numId w:val="2"/>
-              </w:numPr>
-            </w:pPr>
-            <w:r>
-              <w:rPr>
-                <w:rFonts w:ascii="Calibri" w:eastAsia="Calibri" w:hAnsi="Calibri" w:cs="Calibri"/>
-                <w:color w:val="000000"/>
-                <w:sz w:val="15"/>
-                <w:szCs w:val="15"/>
-              </w:rPr>
-              <w:t>Owned end-to-end ML pipeline: dataset acquisition, cleaning, preprocessing, YOLO config, training, tuning</w:t>
-            </w:r>
-          </w:p>
-          <w:p>
-            <w:pPr>
-              <w:pStyle w:val="ListParagraph"/>
-              <w:numPr>
-                <w:ilvl w:val="0"/>
-                <w:numId w:val="2"/>
-              </w:numPr>
-            </w:pPr>
-            <w:r>
-              <w:rPr>
-                <w:rFonts w:ascii="Calibri" w:eastAsia="Calibri" w:hAnsi="Calibri" w:cs="Calibri"/>
-                <w:color w:val="000000"/>
-                <w:sz w:val="15"/>
-                <w:szCs w:val="15"/>
-              </w:rPr>
-              <w:t>Built reporting API and data filtering logic to surface meaningful detection results</w:t>
-            </w:r>
-          </w:p>
-          <w:p>
-            <w:pPr>
-              <w:pStyle w:val="ListParagraph"/>
-              <w:numPr>
-                <w:ilvl w:val="0"/>
-                <w:numId w:val="2"/>
-              </w:numPr>
-            </w:pPr>
-            <w:r>
-              <w:rPr>
-                <w:rFonts w:ascii="Calibri" w:eastAsia="Calibri" w:hAnsi="Calibri" w:cs="Calibri"/>
-                <w:color w:val="000000"/>
-                <w:sz w:val="15"/>
-                <w:szCs w:val="15"/>
-              </w:rPr>
-              <w:t>Containerised entire system with Docker — multi-service orchestration for consistent dev/deployment</w:t>
-            </w:r>
-          </w:p>
-          <w:p>
-            <w:pPr>
-              <w:pStyle w:val="ListParagraph"/>
-              <w:numPr>
-                <w:ilvl w:val="0"/>
-                <w:numId w:val="2"/>
-              </w:numPr>
-            </w:pPr>
-            <w:r>
-              <w:rPr>
-                <w:rFonts w:ascii="Calibri" w:eastAsia="Calibri" w:hAnsi="Calibri" w:cs="Calibri"/>
-                <w:color w:val="000000"/>
-                <w:sz w:val="15"/>
-                <w:szCs w:val="15"/>
-              </w:rPr>
-              <w:t>Coordinated stakeholder reporting across lecturers, deans, and external partners</w:t>
-            </w:r>
-          </w:p>
-          <w:p>
-            <w:pPr>
-              <w:spacing w:after="30"/>
-            </w:pPr>
-            <w:r>
-              <w:rPr>
-                <w:rFonts w:ascii="Calibri" w:eastAsia="Calibri" w:hAnsi="Calibri" w:cs="Calibri"/>
-                <w:i/>
-                <w:iCs/>
-                <w:color w:val="666666"/>
-                <w:sz w:val="14"/>
-                <w:szCs w:val="14"/>
-              </w:rPr>
-              <w:t xml:space="preserve">Tech: Python · </w:t>
-            </w:r>
-            <w:proofErr w:type="spellStart"/>
-            <w:r>
-              <w:rPr>
-                <w:rFonts w:ascii="Calibri" w:eastAsia="Calibri" w:hAnsi="Calibri" w:cs="Calibri"/>
-                <w:i/>
-                <w:iCs/>
-                <w:color w:val="666666"/>
-                <w:sz w:val="14"/>
-                <w:szCs w:val="14"/>
-              </w:rPr>
-              <w:t>Ultralytics</w:t>
-            </w:r>
-            <w:proofErr w:type="spellEnd"/>
-            <w:r>
-              <w:rPr>
-                <w:rFonts w:ascii="Calibri" w:eastAsia="Calibri" w:hAnsi="Calibri" w:cs="Calibri"/>
-                <w:i/>
-                <w:iCs/>
-                <w:color w:val="666666"/>
-                <w:sz w:val="14"/>
-                <w:szCs w:val="14"/>
-              </w:rPr>
-              <w:t xml:space="preserve"> YOLOv8 · Docker · Computer Vision · OpenCV · NumPy</w:t>
-            </w:r>
-          </w:p>
-          <w:p>
-            <w:pPr>
-              <w:spacing w:before="50" w:after="15"/>
-            </w:pPr>
-            <w:proofErr w:type="spellStart"/>
-            <w:r>
-              <w:rPr>
-                <w:rFonts w:ascii="Calibri" w:eastAsia="Calibri" w:hAnsi="Calibri" w:cs="Calibri"/>
-                <w:b/>
-                <w:bCs/>
-                <w:color w:val="1B2A4A"/>
-                <w:sz w:val="16"/>
-                <w:szCs w:val="16"/>
-              </w:rPr>
               <w:t>MagCourt</w:t>
             </w:r>
-            <w:proofErr w:type="spellEnd"/>
             <w:r>
               <w:rPr>
                 <w:rFonts w:ascii="Calibri" w:eastAsia="Calibri" w:hAnsi="Calibri" w:cs="Calibri"/>
@@ -1901,6 +1469,42 @@
           <w:szCs w:val="15"/>
         </w:rPr>
         <w:t>ot0311</w:t>
+      </w:r>
+      <w:r>
+        <w:rPr>
+          <w:rFonts w:ascii="Calibri" w:eastAsia="Calibri" w:hAnsi="Calibri" w:cs="Calibri"/>
+          <w:color w:val="666666"/>
+          <w:sz w:val="15"/>
+          <w:szCs w:val="15"/>
+        </w:rPr>
+        <w:t xml:space="preserve">   </w:t>
+      </w:r>
+      <w:r>
+        <w:rPr>
+          <w:rFonts w:ascii="Calibri" w:eastAsia="Calibri" w:hAnsi="Calibri" w:cs="Calibri"/>
+          <w:color w:val="C9A84C"/>
+          <w:sz w:val="15"/>
+          <w:szCs w:val="15"/>
+        </w:rPr>
+        <w:t>|</w:t>
+      </w:r>
+      <w:r>
+        <w:rPr>
+          <w:rFonts w:ascii="Calibri" w:eastAsia="Calibri" w:hAnsi="Calibri" w:cs="Calibri"/>
+          <w:color w:val="C9A84C"/>
+          <w:sz w:val="15"/>
+          <w:szCs w:val="15"/>
+        </w:rPr>
+        <w:t xml:space="preserve"> </w:t>
+      </w:r>
+      <w:r>
+        <w:rPr>
+          <w:rFonts w:ascii="Calibri" w:eastAsia="Calibri" w:hAnsi="Calibri" w:cs="Calibri"/>
+          <w:color w:val="666666"/>
+          <w:sz w:val="15"/>
+          <w:szCs w:val="15"/>
+        </w:rPr>
+        <w:t>suhiljugroop.com</w:t>
       </w:r>
     </w:p>
     <w:p/>

</xml_diff>